<commit_message>
release: 2.6.1 note des figures et tableaux, Copyright, credits entre parentheses, typographie du parser
</commit_message>
<xml_diff>
--- a/revue-template/Pronto - modele d'article_DE.docx
+++ b/revue-template/Pronto - modele d'article_DE.docx
@@ -1246,6 +1246,24 @@
           <w:lang w:val="de-CH"/>
         </w:rPr>
         <w:t xml:space="preserve">: </w:t>
+      </w:r>
+    </w:p>
+    <w:p>
+      <w:pPr>
+        <w:pStyle w:val="SZHCleAbbTab"/>
+        <w:rPr>
+          <w:rFonts w:asciiTheme="majorHAnsi" w:hAnsiTheme="majorHAnsi" w:cstheme="majorHAnsi"/>
+          <w:noProof/>
+          <w:lang w:val="de-CH"/>
+        </w:rPr>
+      </w:pPr>
+      <w:r>
+        <w:rPr>
+          <w:rFonts w:asciiTheme="majorHAnsi" w:hAnsiTheme="majorHAnsi" w:cstheme="majorHAnsi"/>
+          <w:noProof/>
+          <w:lang w:val="de-CH"/>
+        </w:rPr>
+        <w:t xml:space="preserve">Notiz: </w:t>
       </w:r>
     </w:p>
     <w:p>
@@ -1452,6 +1470,24 @@
         <w:t xml:space="preserve">: </w:t>
       </w:r>
     </w:p>
+    <w:p>
+      <w:pPr>
+        <w:pStyle w:val="SZHCleAbbTab"/>
+        <w:rPr>
+          <w:rFonts w:asciiTheme="majorHAnsi" w:hAnsiTheme="majorHAnsi" w:cstheme="majorHAnsi"/>
+          <w:noProof/>
+          <w:lang w:val="de-CH"/>
+        </w:rPr>
+      </w:pPr>
+      <w:r>
+        <w:rPr>
+          <w:rFonts w:asciiTheme="majorHAnsi" w:hAnsiTheme="majorHAnsi" w:cstheme="majorHAnsi"/>
+          <w:noProof/>
+          <w:lang w:val="de-CH"/>
+        </w:rPr>
+        <w:t xml:space="preserve">Notiz: </w:t>
+      </w:r>
+    </w:p>
     <w:tbl>
       <w:tblPr>
         <w:tblW w:w="8000" w:type="dxa"/>
@@ -1597,7 +1633,7 @@
           <w:noProof/>
           <w:lang w:val="de-CH"/>
         </w:rPr>
-        <w:t xml:space="preserve"> Sie diese vier </w:t>
+        <w:t xml:space="preserve"> Sie diese fünf </w:t>
       </w:r>
       <w:r>
         <w:rPr>

</xml_diff>